<commit_message>
docs: update readme files and submission formats with google drive demo link
</commit_message>
<xml_diff>
--- a/docs/MARGI_IIT_MADRAS_HACKATHON_SUBMISSION.docx
+++ b/docs/MARGI_IIT_MADRAS_HACKATHON_SUBMISSION.docx
@@ -1063,6 +1063,40 @@
               <w:rPr>
                 <w:b/>
               </w:rPr>
+              <w:t>Official Demo &amp; Docs Folder</w:t>
+            </w:r>
+          </w:p>
+        </w:tc>
+        <w:tc>
+          <w:tcPr>
+            <w:tcW w:type="dxa" w:w="4320"/>
+          </w:tcPr>
+          <w:p>
+            <w:pPr>
+              <w:spacing w:before="60" w:after="60"/>
+            </w:pPr>
+            <w:r/>
+            <w:r>
+              <w:t>[Google Drive Folder](https://drive.google.com/drive/folders/15TaAJGIMtxYrN6eIPGyIJZqyhIHqSmjQ) (Contains final submission docx and video assets)</w:t>
+            </w:r>
+          </w:p>
+        </w:tc>
+      </w:tr>
+      <w:tr>
+        <w:tc>
+          <w:tcPr>
+            <w:tcW w:type="dxa" w:w="4320"/>
+            <w:shd w:fill="F9FAFB"/>
+          </w:tcPr>
+          <w:p>
+            <w:pPr>
+              <w:spacing w:before="60" w:after="60"/>
+            </w:pPr>
+            <w:r/>
+            <w:r>
+              <w:rPr>
+                <w:b/>
+              </w:rPr>
               <w:t>Android Build CI</w:t>
             </w:r>
           </w:p>
@@ -1070,6 +1104,7 @@
         <w:tc>
           <w:tcPr>
             <w:tcW w:type="dxa" w:w="4320"/>
+            <w:shd w:fill="F9FAFB"/>
           </w:tcPr>
           <w:p>
             <w:pPr>

</xml_diff>

<commit_message>
docs: integrate official app demo video link and synchronize submission docx
</commit_message>
<xml_diff>
--- a/docs/MARGI_IIT_MADRAS_HACKATHON_SUBMISSION.docx
+++ b/docs/MARGI_IIT_MADRAS_HACKATHON_SUBMISSION.docx
@@ -1097,6 +1097,40 @@
               <w:rPr>
                 <w:b/>
               </w:rPr>
+              <w:t>Official Demo Video</w:t>
+            </w:r>
+          </w:p>
+        </w:tc>
+        <w:tc>
+          <w:tcPr>
+            <w:tcW w:type="dxa" w:w="4320"/>
+            <w:shd w:fill="F9FAFB"/>
+          </w:tcPr>
+          <w:p>
+            <w:pPr>
+              <w:spacing w:before="60" w:after="60"/>
+            </w:pPr>
+            <w:r/>
+            <w:r>
+              <w:t>[Watch App Demo Video](https://drive.google.com/file/d/10k0xtmzZXehshu93oddi1c_znsuy_eti/view?usp=sharing) (5-minute walkthrough for judges)</w:t>
+            </w:r>
+          </w:p>
+        </w:tc>
+      </w:tr>
+      <w:tr>
+        <w:tc>
+          <w:tcPr>
+            <w:tcW w:type="dxa" w:w="4320"/>
+          </w:tcPr>
+          <w:p>
+            <w:pPr>
+              <w:spacing w:before="60" w:after="60"/>
+            </w:pPr>
+            <w:r/>
+            <w:r>
+              <w:rPr>
+                <w:b/>
+              </w:rPr>
               <w:t>Android Build CI</w:t>
             </w:r>
           </w:p>
@@ -1104,7 +1138,6 @@
         <w:tc>
           <w:tcPr>
             <w:tcW w:type="dxa" w:w="4320"/>
-            <w:shd w:fill="F9FAFB"/>
           </w:tcPr>
           <w:p>
             <w:pPr>
@@ -9809,6 +9842,21 @@
       </w:r>
       <w:r>
         <w:t xml:space="preserve"> [v2.0.0-production APK](https://github.com/Stormynubee/Margi/releases/tag/v2.0.0-production)</w:t>
+      </w:r>
+    </w:p>
+    <w:p>
+      <w:pPr>
+        <w:pStyle w:val="ListBullet"/>
+        <w:spacing w:after="60" w:before="0"/>
+      </w:pPr>
+      <w:r>
+        <w:rPr>
+          <w:b/>
+        </w:rPr>
+        <w:t>Official Demo Video:</w:t>
+      </w:r>
+      <w:r>
+        <w:t xml:space="preserve"> [Watch App Demo Video](https://drive.google.com/file/d/10k0xtmzZXehshu93oddi1c_znsuy_eti/view?usp=sharing) (5-minute walkthrough for judges)</w:t>
       </w:r>
     </w:p>
     <w:p>

</xml_diff>